<commit_message>
Ready to submit iteration 2.
</commit_message>
<xml_diff>
--- a/Iteration2ProgressSummary.docx
+++ b/Iteration2ProgressSummary.docx
@@ -3,29 +3,60 @@
 <w:document xmlns:wpc="http://schemas.microsoft.com/office/word/2010/wordprocessingCanvas" xmlns:cx="http://schemas.microsoft.com/office/drawing/2014/chartex" xmlns:cx1="http://schemas.microsoft.com/office/drawing/2015/9/8/chartex" xmlns:cx2="http://schemas.microsoft.com/office/drawing/2015/10/21/chartex" xmlns:cx3="http://schemas.microsoft.com/office/drawing/2016/5/9/chartex" xmlns:cx4="http://schemas.microsoft.com/office/drawing/2016/5/10/chartex" xmlns:cx5="http://schemas.microsoft.com/office/drawing/2016/5/11/chartex" xmlns:cx6="http://schemas.microsoft.com/office/drawing/2016/5/12/chartex" xmlns:cx7="http://schemas.microsoft.com/office/drawing/2016/5/13/chartex" xmlns:cx8="http://schemas.microsoft.com/office/drawing/2016/5/14/chartex" xmlns:mc="http://schemas.openxmlformats.org/markup-compatibility/2006" xmlns:aink="http://schemas.microsoft.com/office/drawing/2016/ink" xmlns:am3d="http://schemas.microsoft.com/office/drawing/2017/model3d" xmlns:o="urn:schemas-microsoft-com:office:office" xmlns:oel="http://schemas.microsoft.com/office/2019/extlst" xmlns:r="http://schemas.openxmlformats.org/officeDocument/2006/relationships" xmlns:m="http://schemas.openxmlformats.org/officeDocument/2006/math" xmlns:v="urn:schemas-microsoft-com:vml" xmlns:wp14="http://schemas.microsoft.com/office/word/2010/wordprocessingDrawing" xmlns:wp="http://schemas.openxmlformats.org/drawingml/2006/wordprocessingDrawing" xmlns:w10="urn:schemas-microsoft-com:office:word" xmlns:w="http://schemas.openxmlformats.org/wordprocessingml/2006/main" xmlns:w14="http://schemas.microsoft.com/office/word/2010/wordml" xmlns:w15="http://schemas.microsoft.com/office/word/2012/wordml" xmlns:w16cex="http://schemas.microsoft.com/office/word/2018/wordml/cex" xmlns:w16cid="http://schemas.microsoft.com/office/word/2016/wordml/cid" xmlns:w16="http://schemas.microsoft.com/office/word/2018/wordml" xmlns:w16du="http://schemas.microsoft.com/office/word/2023/wordml/word16du" xmlns:w16sdtdh="http://schemas.microsoft.com/office/word/2020/wordml/sdtdatahash" xmlns:w16sdtfl="http://schemas.microsoft.com/office/word/2024/wordml/sdtformatlock" xmlns:w16se="http://schemas.microsoft.com/office/word/2015/wordml/symex" xmlns:wpg="http://schemas.microsoft.com/office/word/2010/wordprocessingGroup" xmlns:wpi="http://schemas.microsoft.com/office/word/2010/wordprocessingInk" xmlns:wne="http://schemas.microsoft.com/office/word/2006/wordml" xmlns:wps="http://schemas.microsoft.com/office/word/2010/wordprocessingShape" mc:Ignorable="w14 w15 w16se w16cid w16 w16cex w16sdtdh w16sdtfl w16du wp14">
   <w:body>
     <w:p>
+      <w:pPr>
+        <w:pStyle w:val="Heading1"/>
+      </w:pPr>
+      <w:proofErr w:type="spellStart"/>
+      <w:r>
+        <w:t>Github</w:t>
+      </w:r>
+      <w:proofErr w:type="spellEnd"/>
+      <w:r>
+        <w:t xml:space="preserve"> link</w:t>
+      </w:r>
+    </w:p>
+    <w:p>
+      <w:r>
+        <w:t>https://github.com/SWillyams/CouncilRequestClassifier</w:t>
+      </w:r>
+    </w:p>
+    <w:p>
+      <w:pPr>
+        <w:pStyle w:val="Heading1"/>
+      </w:pPr>
+      <w:r>
+        <w:t>Training and testing</w:t>
+      </w:r>
+      <w:r>
+        <w:t>.</w:t>
+      </w:r>
+    </w:p>
+    <w:p>
       <w:r>
         <w:t xml:space="preserve">20 Duplicates were removed from </w:t>
       </w:r>
       <w:r>
         <w:t>training data.</w:t>
       </w:r>
-    </w:p>
-    <w:p>
-      <w:r>
-        <w:t>Final training achieved about 63% accuracy</w:t>
-      </w:r>
-      <w:r>
-        <w:t>.</w:t>
-      </w:r>
-    </w:p>
-    <w:p>
-      <w:r>
-        <w:t xml:space="preserve">A document describing testing in detail is </w:t>
-      </w:r>
-      <w:r>
-        <w:t xml:space="preserve">in the same folder: </w:t>
-      </w:r>
-      <w:hyperlink r:id="rId5" w:history="1">
+      <w:r>
+        <w:t xml:space="preserve"> </w:t>
+      </w:r>
+      <w:r>
+        <w:t>Extensive testing using all available data was performed</w:t>
+      </w:r>
+      <w:r>
+        <w:t>,</w:t>
+      </w:r>
+      <w:r>
+        <w:t xml:space="preserve"> </w:t>
+      </w:r>
+      <w:r>
+        <w:t>the</w:t>
+      </w:r>
+      <w:r>
+        <w:t xml:space="preserve"> document describing testing in detail is in the same folder: </w:t>
+      </w:r>
+      <w:hyperlink r:id="rId7" w:history="1">
         <w:r>
           <w:rPr>
             <w:rStyle w:val="Hyperlink"/>
@@ -57,67 +88,703 @@
           <w:t>.docx</w:t>
         </w:r>
       </w:hyperlink>
+      <w:r>
+        <w:t xml:space="preserve">. </w:t>
+      </w:r>
+      <w:r>
+        <w:t>Final training achieved a</w:t>
+      </w:r>
+      <w:r>
+        <w:t>pproximately</w:t>
+      </w:r>
+      <w:r>
+        <w:t xml:space="preserve"> 63% accuracy</w:t>
+      </w:r>
+      <w:r>
+        <w:t>.</w:t>
+      </w:r>
+      <w:r>
+        <w:t xml:space="preserve"> </w:t>
+      </w:r>
     </w:p>
     <w:p>
       <w:r>
         <w:t xml:space="preserve">Training and testing </w:t>
       </w:r>
-      <w:r>
-        <w:t xml:space="preserve">was completed using ModelTraining.py which uses </w:t>
-      </w:r>
-    </w:p>
-    <w:p/>
-    <w:p>
-      <w:r>
-        <w:t>Requests related to roading were difficult to categorise.</w:t>
-      </w:r>
-    </w:p>
-    <w:p>
+      <w:proofErr w:type="gramStart"/>
+      <w:r>
+        <w:t>was</w:t>
+      </w:r>
+      <w:proofErr w:type="gramEnd"/>
+      <w:r>
+        <w:t xml:space="preserve"> completed using </w:t>
+      </w:r>
+      <w:r>
+        <w:t>training/</w:t>
+      </w:r>
+      <w:r>
+        <w:t xml:space="preserve">ModelTraining.py which uses </w:t>
+      </w:r>
+      <w:r>
+        <w:t>training/</w:t>
+      </w:r>
+      <w:r>
+        <w:t>data_pr</w:t>
+      </w:r>
+      <w:r>
+        <w:t>ocess_lib.py</w:t>
+      </w:r>
+      <w:r>
+        <w:t xml:space="preserve">, pandas, </w:t>
+      </w:r>
+      <w:proofErr w:type="spellStart"/>
+      <w:r>
+        <w:t>joblib</w:t>
+      </w:r>
+      <w:proofErr w:type="spellEnd"/>
+      <w:r>
+        <w:t xml:space="preserve"> and scikit-learn. Full requirements in training/requirements.txt</w:t>
+      </w:r>
+      <w:r>
+        <w:t>.</w:t>
+      </w:r>
+    </w:p>
+    <w:p>
+      <w:r>
+        <w:t>Requests related to roading were difficult to categorise</w:t>
+      </w:r>
+      <w:r>
+        <w:t xml:space="preserve">, see </w:t>
+      </w:r>
+      <w:r>
+        <w:t>testing summary doc</w:t>
+      </w:r>
+      <w:r>
+        <w:t>.</w:t>
+      </w:r>
+      <w:r>
+        <w:t xml:space="preserve"> </w:t>
+      </w:r>
       <w:r>
         <w:t>Training would be improved with more data</w:t>
       </w:r>
-    </w:p>
-    <w:p>
+      <w:r>
+        <w:t xml:space="preserve">. </w:t>
+      </w:r>
       <w:r>
         <w:t>Due to small training data size with uneven numbers of useful keywords, inverse document frequency weighing hurts prediction accuracy.</w:t>
       </w:r>
-    </w:p>
-    <w:p>
+      <w:r>
+        <w:t xml:space="preserve"> </w:t>
+      </w:r>
       <w:r>
         <w:t>Due to small training data size, minimum document frequency should be set at 1.</w:t>
       </w:r>
-    </w:p>
-    <w:p>
+      <w:r>
+        <w:t xml:space="preserve"> </w:t>
+      </w:r>
       <w:r>
         <w:t>Due to small training data size, n-gram maximum should be set at 1.</w:t>
+      </w:r>
+    </w:p>
+    <w:p>
+      <w:r>
+        <w:t>Saved train</w:t>
+      </w:r>
+      <w:r>
+        <w:t xml:space="preserve">ed model in /model/ </w:t>
+      </w:r>
+      <w:proofErr w:type="spellStart"/>
+      <w:proofErr w:type="gramStart"/>
+      <w:r>
+        <w:t>model</w:t>
+      </w:r>
+      <w:r>
+        <w:t>.joblib</w:t>
+      </w:r>
+      <w:proofErr w:type="spellEnd"/>
+      <w:proofErr w:type="gramEnd"/>
+      <w:r>
+        <w:t xml:space="preserve"> and </w:t>
+      </w:r>
+      <w:proofErr w:type="spellStart"/>
+      <w:proofErr w:type="gramStart"/>
+      <w:r>
+        <w:t>vectoriser.joblib</w:t>
+      </w:r>
+      <w:proofErr w:type="spellEnd"/>
+      <w:proofErr w:type="gramEnd"/>
+    </w:p>
+    <w:p>
+      <w:pPr>
+        <w:pStyle w:val="Heading1"/>
+      </w:pPr>
+      <w:r>
+        <w:t>API</w:t>
+      </w:r>
+    </w:p>
+    <w:p>
+      <w:proofErr w:type="gramStart"/>
+      <w:r>
+        <w:t>An</w:t>
+      </w:r>
+      <w:proofErr w:type="gramEnd"/>
+      <w:r>
+        <w:t xml:space="preserve"> quick API was built with </w:t>
+      </w:r>
+      <w:proofErr w:type="spellStart"/>
+      <w:r>
+        <w:t>fastAPI</w:t>
+      </w:r>
+      <w:proofErr w:type="spellEnd"/>
+      <w:r>
+        <w:t xml:space="preserve"> and is contained in the /API folder with requirements.txt</w:t>
+      </w:r>
+      <w:r>
+        <w:t xml:space="preserve">. This is </w:t>
+      </w:r>
+      <w:r>
+        <w:t>a</w:t>
+      </w:r>
+      <w:r>
+        <w:t xml:space="preserve"> </w:t>
+      </w:r>
+      <w:r>
+        <w:t xml:space="preserve">functional prototype </w:t>
+      </w:r>
+      <w:r>
+        <w:t xml:space="preserve">aimed at </w:t>
+      </w:r>
+      <w:r>
+        <w:t>meeting the API specification</w:t>
+      </w:r>
+      <w:r>
+        <w:t>, not a final product</w:t>
+      </w:r>
+      <w:r>
+        <w:t>.</w:t>
       </w:r>
     </w:p>
     <w:p>
       <w:pPr>
         <w:rPr>
-          <w:color w:val="EE0000"/>
+          <w:b/>
+          <w:bCs/>
         </w:rPr>
       </w:pPr>
       <w:r>
         <w:rPr>
-          <w:color w:val="EE0000"/>
+          <w:b/>
+          <w:bCs/>
         </w:rPr>
-        <w:t>Final model training was saved</w:t>
-      </w:r>
-    </w:p>
-    <w:p>
-      <w:r>
-        <w:t xml:space="preserve">Training and testing code was included with the zip and </w:t>
-      </w:r>
+        <w:t>Instructions</w:t>
+      </w:r>
+    </w:p>
+    <w:p>
+      <w:r>
+        <w:t>Run server with "</w:t>
+      </w:r>
+      <w:proofErr w:type="spellStart"/>
+      <w:r>
+        <w:t>py</w:t>
+      </w:r>
+      <w:proofErr w:type="spellEnd"/>
+      <w:r>
+        <w:t xml:space="preserve"> -m </w:t>
+      </w:r>
+      <w:proofErr w:type="spellStart"/>
+      <w:r>
+        <w:t>uvicorn</w:t>
+      </w:r>
+      <w:proofErr w:type="spellEnd"/>
+      <w:r>
+        <w:t xml:space="preserve"> </w:t>
+      </w:r>
+      <w:proofErr w:type="spellStart"/>
+      <w:r>
+        <w:t>main:app</w:t>
+      </w:r>
+      <w:proofErr w:type="spellEnd"/>
+      <w:r>
+        <w:t xml:space="preserve"> --reload" </w:t>
+      </w:r>
+      <w:r>
+        <w:t>from API folder.</w:t>
+      </w:r>
+    </w:p>
+    <w:p>
+      <w:r>
+        <w:t xml:space="preserve">Open localhost:8000/docs and navigate to </w:t>
+      </w:r>
+      <w:r>
+        <w:t>/</w:t>
+      </w:r>
+      <w:r>
+        <w:t xml:space="preserve">predict </w:t>
+      </w:r>
+    </w:p>
+    <w:p>
+      <w:r>
+        <w:t>Input text for prediction</w:t>
+      </w:r>
+    </w:p>
+    <w:p>
+      <w:r>
+        <w:t xml:space="preserve">Note the code needed for a </w:t>
+      </w:r>
+      <w:proofErr w:type="spellStart"/>
+      <w:r>
+        <w:t>json</w:t>
+      </w:r>
+      <w:proofErr w:type="spellEnd"/>
+      <w:r>
+        <w:t xml:space="preserve"> type request is currently commented out in favour of </w:t>
+      </w:r>
+      <w:r>
+        <w:t>an easier to test string input.</w:t>
+      </w:r>
+    </w:p>
+    <w:p>
       <w:r>
         <w:rPr>
-          <w:color w:val="EE0000"/>
+          <w:b/>
+          <w:bCs/>
         </w:rPr>
-        <w:t>is available at</w:t>
+        <w:t>Screenshots</w:t>
+      </w:r>
+      <w:r>
+        <w:t>:</w:t>
+      </w:r>
+    </w:p>
+    <w:p>
+      <w:r>
+        <w:rPr>
+          <w:noProof/>
+        </w:rPr>
+        <w:drawing>
+          <wp:inline distT="0" distB="0" distL="0" distR="0" wp14:anchorId="35F3611F" wp14:editId="6C56D62C">
+            <wp:extent cx="2907030" cy="819785"/>
+            <wp:effectExtent l="0" t="0" r="7620" b="0"/>
+            <wp:docPr id="1861074308" name="Picture 1"/>
+            <wp:cNvGraphicFramePr>
+              <a:graphicFrameLocks xmlns:a="http://schemas.openxmlformats.org/drawingml/2006/main" noChangeAspect="1"/>
+            </wp:cNvGraphicFramePr>
+            <a:graphic xmlns:a="http://schemas.openxmlformats.org/drawingml/2006/main">
+              <a:graphicData uri="http://schemas.openxmlformats.org/drawingml/2006/picture">
+                <pic:pic xmlns:pic="http://schemas.openxmlformats.org/drawingml/2006/picture">
+                  <pic:nvPicPr>
+                    <pic:cNvPr id="0" name="Picture 1"/>
+                    <pic:cNvPicPr>
+                      <a:picLocks noChangeAspect="1" noChangeArrowheads="1"/>
+                    </pic:cNvPicPr>
+                  </pic:nvPicPr>
+                  <pic:blipFill>
+                    <a:blip r:embed="rId8">
+                      <a:extLst>
+                        <a:ext uri="{28A0092B-C50C-407E-A947-70E740481C1C}">
+                          <a14:useLocalDpi xmlns:a14="http://schemas.microsoft.com/office/drawing/2010/main" val="0"/>
+                        </a:ext>
+                      </a:extLst>
+                    </a:blip>
+                    <a:srcRect/>
+                    <a:stretch>
+                      <a:fillRect/>
+                    </a:stretch>
+                  </pic:blipFill>
+                  <pic:spPr bwMode="auto">
+                    <a:xfrm>
+                      <a:off x="0" y="0"/>
+                      <a:ext cx="2907030" cy="819785"/>
+                    </a:xfrm>
+                    <a:prstGeom prst="rect">
+                      <a:avLst/>
+                    </a:prstGeom>
+                    <a:noFill/>
+                    <a:ln>
+                      <a:noFill/>
+                    </a:ln>
+                  </pic:spPr>
+                </pic:pic>
+              </a:graphicData>
+            </a:graphic>
+          </wp:inline>
+        </w:drawing>
+      </w:r>
+    </w:p>
+    <w:p>
+      <w:r>
+        <w:rPr>
+          <w:noProof/>
+        </w:rPr>
+        <w:lastRenderedPageBreak/>
+        <w:drawing>
+          <wp:inline distT="0" distB="0" distL="0" distR="0" wp14:anchorId="7E286B7E" wp14:editId="1321F181">
+            <wp:extent cx="2933065" cy="836930"/>
+            <wp:effectExtent l="0" t="0" r="635" b="1270"/>
+            <wp:docPr id="526735190" name="Picture 2"/>
+            <wp:cNvGraphicFramePr>
+              <a:graphicFrameLocks xmlns:a="http://schemas.openxmlformats.org/drawingml/2006/main" noChangeAspect="1"/>
+            </wp:cNvGraphicFramePr>
+            <a:graphic xmlns:a="http://schemas.openxmlformats.org/drawingml/2006/main">
+              <a:graphicData uri="http://schemas.openxmlformats.org/drawingml/2006/picture">
+                <pic:pic xmlns:pic="http://schemas.openxmlformats.org/drawingml/2006/picture">
+                  <pic:nvPicPr>
+                    <pic:cNvPr id="0" name="Picture 2"/>
+                    <pic:cNvPicPr>
+                      <a:picLocks noChangeAspect="1" noChangeArrowheads="1"/>
+                    </pic:cNvPicPr>
+                  </pic:nvPicPr>
+                  <pic:blipFill>
+                    <a:blip r:embed="rId9">
+                      <a:extLst>
+                        <a:ext uri="{28A0092B-C50C-407E-A947-70E740481C1C}">
+                          <a14:useLocalDpi xmlns:a14="http://schemas.microsoft.com/office/drawing/2010/main" val="0"/>
+                        </a:ext>
+                      </a:extLst>
+                    </a:blip>
+                    <a:srcRect/>
+                    <a:stretch>
+                      <a:fillRect/>
+                    </a:stretch>
+                  </pic:blipFill>
+                  <pic:spPr bwMode="auto">
+                    <a:xfrm>
+                      <a:off x="0" y="0"/>
+                      <a:ext cx="2933065" cy="836930"/>
+                    </a:xfrm>
+                    <a:prstGeom prst="rect">
+                      <a:avLst/>
+                    </a:prstGeom>
+                    <a:noFill/>
+                    <a:ln>
+                      <a:noFill/>
+                    </a:ln>
+                  </pic:spPr>
+                </pic:pic>
+              </a:graphicData>
+            </a:graphic>
+          </wp:inline>
+        </w:drawing>
+      </w:r>
+    </w:p>
+    <w:p>
+      <w:r>
+        <w:t>Simple post:</w:t>
+      </w:r>
+    </w:p>
+    <w:p>
+      <w:r>
+        <w:rPr>
+          <w:noProof/>
+        </w:rPr>
+        <w:drawing>
+          <wp:inline distT="0" distB="0" distL="0" distR="0" wp14:anchorId="0ADB6837" wp14:editId="1E39C5BF">
+            <wp:extent cx="4315660" cy="3769743"/>
+            <wp:effectExtent l="0" t="0" r="8890" b="2540"/>
+            <wp:docPr id="1892673221" name="Picture 3"/>
+            <wp:cNvGraphicFramePr>
+              <a:graphicFrameLocks xmlns:a="http://schemas.openxmlformats.org/drawingml/2006/main" noChangeAspect="1"/>
+            </wp:cNvGraphicFramePr>
+            <a:graphic xmlns:a="http://schemas.openxmlformats.org/drawingml/2006/main">
+              <a:graphicData uri="http://schemas.openxmlformats.org/drawingml/2006/picture">
+                <pic:pic xmlns:pic="http://schemas.openxmlformats.org/drawingml/2006/picture">
+                  <pic:nvPicPr>
+                    <pic:cNvPr id="0" name="Picture 3"/>
+                    <pic:cNvPicPr>
+                      <a:picLocks noChangeAspect="1" noChangeArrowheads="1"/>
+                    </pic:cNvPicPr>
+                  </pic:nvPicPr>
+                  <pic:blipFill>
+                    <a:blip r:embed="rId10">
+                      <a:extLst>
+                        <a:ext uri="{28A0092B-C50C-407E-A947-70E740481C1C}">
+                          <a14:useLocalDpi xmlns:a14="http://schemas.microsoft.com/office/drawing/2010/main" val="0"/>
+                        </a:ext>
+                      </a:extLst>
+                    </a:blip>
+                    <a:srcRect/>
+                    <a:stretch>
+                      <a:fillRect/>
+                    </a:stretch>
+                  </pic:blipFill>
+                  <pic:spPr bwMode="auto">
+                    <a:xfrm>
+                      <a:off x="0" y="0"/>
+                      <a:ext cx="4325079" cy="3777971"/>
+                    </a:xfrm>
+                    <a:prstGeom prst="rect">
+                      <a:avLst/>
+                    </a:prstGeom>
+                    <a:noFill/>
+                    <a:ln>
+                      <a:noFill/>
+                    </a:ln>
+                  </pic:spPr>
+                </pic:pic>
+              </a:graphicData>
+            </a:graphic>
+          </wp:inline>
+        </w:drawing>
+      </w:r>
+    </w:p>
+    <w:p>
+      <w:r>
+        <w:t xml:space="preserve">JSON style post: (currently </w:t>
+      </w:r>
+      <w:r>
+        <w:t>disabled)</w:t>
+      </w:r>
+    </w:p>
+    <w:p>
+      <w:r>
+        <w:rPr>
+          <w:noProof/>
+        </w:rPr>
+        <w:drawing>
+          <wp:inline distT="0" distB="0" distL="0" distR="0" wp14:anchorId="1BE94366" wp14:editId="696CDB3A">
+            <wp:extent cx="4331335" cy="2915728"/>
+            <wp:effectExtent l="0" t="0" r="0" b="0"/>
+            <wp:docPr id="723647046" name="Picture 5"/>
+            <wp:cNvGraphicFramePr>
+              <a:graphicFrameLocks xmlns:a="http://schemas.openxmlformats.org/drawingml/2006/main" noChangeAspect="1"/>
+            </wp:cNvGraphicFramePr>
+            <a:graphic xmlns:a="http://schemas.openxmlformats.org/drawingml/2006/main">
+              <a:graphicData uri="http://schemas.openxmlformats.org/drawingml/2006/picture">
+                <pic:pic xmlns:pic="http://schemas.openxmlformats.org/drawingml/2006/picture">
+                  <pic:nvPicPr>
+                    <pic:cNvPr id="0" name="Picture 5"/>
+                    <pic:cNvPicPr>
+                      <a:picLocks noChangeAspect="1" noChangeArrowheads="1"/>
+                    </pic:cNvPicPr>
+                  </pic:nvPicPr>
+                  <pic:blipFill>
+                    <a:blip r:embed="rId11">
+                      <a:extLst>
+                        <a:ext uri="{28A0092B-C50C-407E-A947-70E740481C1C}">
+                          <a14:useLocalDpi xmlns:a14="http://schemas.microsoft.com/office/drawing/2010/main" val="0"/>
+                        </a:ext>
+                      </a:extLst>
+                    </a:blip>
+                    <a:srcRect/>
+                    <a:stretch>
+                      <a:fillRect/>
+                    </a:stretch>
+                  </pic:blipFill>
+                  <pic:spPr bwMode="auto">
+                    <a:xfrm>
+                      <a:off x="0" y="0"/>
+                      <a:ext cx="4342020" cy="2922921"/>
+                    </a:xfrm>
+                    <a:prstGeom prst="rect">
+                      <a:avLst/>
+                    </a:prstGeom>
+                    <a:noFill/>
+                    <a:ln>
+                      <a:noFill/>
+                    </a:ln>
+                  </pic:spPr>
+                </pic:pic>
+              </a:graphicData>
+            </a:graphic>
+          </wp:inline>
+        </w:drawing>
+      </w:r>
+    </w:p>
+    <w:p>
+      <w:pPr>
+        <w:pStyle w:val="Heading1"/>
+      </w:pPr>
+      <w:r>
+        <w:lastRenderedPageBreak/>
+        <w:t>Next iteration:</w:t>
+      </w:r>
+    </w:p>
+    <w:p>
+      <w:r>
+        <w:t>Model training and testing would be more effective with additional training data.</w:t>
+      </w:r>
+      <w:r>
+        <w:t xml:space="preserve"> Will look at publicly available data mentioned in the brief.</w:t>
+      </w:r>
+    </w:p>
+    <w:p>
+      <w:r>
+        <w:t>Although both logistic regression and naïve bayes performed poorly with categorising requests related to roading, they did produce separate results, with logistic regression underestimating roading, and naïve bayes overestimating roading. Using naïve bayes when logistic regression’s confidence is low, or averaging results from both models might improve performance, it is worth investigating.</w:t>
+      </w:r>
+    </w:p>
+    <w:p>
+      <w:r>
+        <w:t>Using a custom stop word list would probably improve performance, especially if inverse document frequency weighing isn’t used.</w:t>
+      </w:r>
+    </w:p>
+    <w:p>
+      <w:r>
+        <w:t xml:space="preserve">Neural </w:t>
+      </w:r>
+      <w:proofErr w:type="gramStart"/>
+      <w:r>
+        <w:t>network based</w:t>
+      </w:r>
+      <w:proofErr w:type="gramEnd"/>
+      <w:r>
+        <w:t xml:space="preserve"> training is unlikely to improve performance with such a small data set. It might still be useful as a fallback method when prediction confidences are low.</w:t>
+      </w:r>
+    </w:p>
+    <w:p>
+      <w:r>
+        <w:t>API needs</w:t>
+      </w:r>
+      <w:r>
+        <w:t xml:space="preserve"> error handling and to handle</w:t>
+      </w:r>
+      <w:r>
+        <w:t xml:space="preserve"> invalid data. </w:t>
+      </w:r>
+      <w:r>
+        <w:t xml:space="preserve">A testing </w:t>
+      </w:r>
+      <w:r>
+        <w:t>program to interact with the API needs to be built.</w:t>
+      </w:r>
+    </w:p>
+    <w:p>
+      <w:pPr>
+        <w:pStyle w:val="Heading1"/>
+      </w:pPr>
+      <w:r>
+        <w:t>Ethic</w:t>
+      </w:r>
+      <w:r>
+        <w:t>s</w:t>
+      </w:r>
+    </w:p>
+    <w:p>
+      <w:r>
+        <w:t>T</w:t>
+      </w:r>
+      <w:r>
+        <w:t>he training data</w:t>
+      </w:r>
+      <w:r>
+        <w:t xml:space="preserve"> needs to be checked to ensure it</w:t>
+      </w:r>
+      <w:r>
+        <w:t xml:space="preserve"> is correct</w:t>
+      </w:r>
+      <w:r>
+        <w:t>, otherwise the model will carry forward mistakes</w:t>
+      </w:r>
+      <w:r>
+        <w:t xml:space="preserve"> into the classifier.</w:t>
+      </w:r>
+    </w:p>
+    <w:p>
+      <w:r>
+        <w:t>Training data doesn’t include</w:t>
+      </w:r>
+      <w:r>
+        <w:t xml:space="preserve"> any</w:t>
+      </w:r>
+      <w:r>
+        <w:t xml:space="preserve"> Māori language</w:t>
+      </w:r>
+      <w:r>
+        <w:t xml:space="preserve"> examples</w:t>
+      </w:r>
+      <w:r>
+        <w:t>.</w:t>
+      </w:r>
+      <w:r>
+        <w:t xml:space="preserve"> The classifier </w:t>
+      </w:r>
+      <w:r>
+        <w:t>may be unable to handle requests with</w:t>
+      </w:r>
+      <w:r>
+        <w:t xml:space="preserve"> words in</w:t>
+      </w:r>
+      <w:r>
+        <w:t xml:space="preserve"> Māori</w:t>
+      </w:r>
+      <w:r>
+        <w:t xml:space="preserve"> correctly</w:t>
+      </w:r>
+      <w:r>
+        <w:t>, resulting in poor performance for people who use Māori in regular communication.</w:t>
+      </w:r>
+      <w:r>
+        <w:t xml:space="preserve"> </w:t>
+      </w:r>
+      <w:r>
+        <w:t>Need to ensure data cleaning doesn’t remove Māori language letters</w:t>
+      </w:r>
+      <w:r>
+        <w:t>; as the letters impart information on word meaning. Standard cleaning removes these letters</w:t>
+      </w:r>
+      <w:r>
+        <w:t>, either removing their meaning, or producing jumbled words.</w:t>
+      </w:r>
+    </w:p>
+    <w:p>
+      <w:r>
+        <w:t>Any s</w:t>
+      </w:r>
+      <w:r>
+        <w:t>t</w:t>
+      </w:r>
+      <w:r>
+        <w:t>r</w:t>
+      </w:r>
+      <w:r>
+        <w:t>eet names</w:t>
+      </w:r>
+      <w:r>
+        <w:t xml:space="preserve"> or areas in the request text</w:t>
+      </w:r>
+      <w:r>
+        <w:t>, will be included in training. Past history</w:t>
+      </w:r>
+      <w:r>
+        <w:t xml:space="preserve"> for a street or area</w:t>
+      </w:r>
+      <w:r>
+        <w:t xml:space="preserve"> may not be an accurate predictor of future categories.</w:t>
+      </w:r>
+      <w:r>
+        <w:t xml:space="preserve"> For example, if a street had a lot of</w:t>
+      </w:r>
+      <w:r>
+        <w:t xml:space="preserve"> roading requests when the training data was collected, the model will use</w:t>
+      </w:r>
+      <w:r>
+        <w:t xml:space="preserve"> the</w:t>
+      </w:r>
+      <w:r>
+        <w:t xml:space="preserve"> street name as a </w:t>
+      </w:r>
+      <w:r>
+        <w:t xml:space="preserve">strong </w:t>
+      </w:r>
+      <w:r>
+        <w:t xml:space="preserve">predictor for </w:t>
+      </w:r>
+      <w:r>
+        <w:t xml:space="preserve">roading requests into the future. For this </w:t>
+      </w:r>
+      <w:r>
+        <w:t>reason,</w:t>
+      </w:r>
+      <w:r>
+        <w:t xml:space="preserve"> the suburb column was not used in the </w:t>
+      </w:r>
+      <w:r>
+        <w:t>training, even though it may have improved model performance in testing.</w:t>
       </w:r>
     </w:p>
     <w:p/>
     <w:sectPr>
+      <w:headerReference w:type="default" r:id="rId12"/>
+      <w:footerReference w:type="default" r:id="rId13"/>
       <w:pgSz w:w="11906" w:h="16838"/>
       <w:pgMar w:top="1440" w:right="1440" w:bottom="1440" w:left="1440" w:header="708" w:footer="708" w:gutter="0"/>
       <w:cols w:space="708"/>
@@ -125,6 +792,198 @@
     </w:sectPr>
   </w:body>
 </w:document>
+</file>
+
+<file path=word/endnotes.xml><?xml version="1.0" encoding="utf-8"?>
+<w:endnotes xmlns:wpc="http://schemas.microsoft.com/office/word/2010/wordprocessingCanvas" xmlns:cx="http://schemas.microsoft.com/office/drawing/2014/chartex" xmlns:cx1="http://schemas.microsoft.com/office/drawing/2015/9/8/chartex" xmlns:cx2="http://schemas.microsoft.com/office/drawing/2015/10/21/chartex" xmlns:cx3="http://schemas.microsoft.com/office/drawing/2016/5/9/chartex" xmlns:cx4="http://schemas.microsoft.com/office/drawing/2016/5/10/chartex" xmlns:cx5="http://schemas.microsoft.com/office/drawing/2016/5/11/chartex" xmlns:cx6="http://schemas.microsoft.com/office/drawing/2016/5/12/chartex" xmlns:cx7="http://schemas.microsoft.com/office/drawing/2016/5/13/chartex" xmlns:cx8="http://schemas.microsoft.com/office/drawing/2016/5/14/chartex" xmlns:mc="http://schemas.openxmlformats.org/markup-compatibility/2006" xmlns:aink="http://schemas.microsoft.com/office/drawing/2016/ink" xmlns:am3d="http://schemas.microsoft.com/office/drawing/2017/model3d" xmlns:o="urn:schemas-microsoft-com:office:office" xmlns:oel="http://schemas.microsoft.com/office/2019/extlst" xmlns:r="http://schemas.openxmlformats.org/officeDocument/2006/relationships" xmlns:m="http://schemas.openxmlformats.org/officeDocument/2006/math" xmlns:v="urn:schemas-microsoft-com:vml" xmlns:wp14="http://schemas.microsoft.com/office/word/2010/wordprocessingDrawing" xmlns:wp="http://schemas.openxmlformats.org/drawingml/2006/wordprocessingDrawing" xmlns:w10="urn:schemas-microsoft-com:office:word" xmlns:w="http://schemas.openxmlformats.org/wordprocessingml/2006/main" xmlns:w14="http://schemas.microsoft.com/office/word/2010/wordml" xmlns:w15="http://schemas.microsoft.com/office/word/2012/wordml" xmlns:w16cex="http://schemas.microsoft.com/office/word/2018/wordml/cex" xmlns:w16cid="http://schemas.microsoft.com/office/word/2016/wordml/cid" xmlns:w16="http://schemas.microsoft.com/office/word/2018/wordml" xmlns:w16du="http://schemas.microsoft.com/office/word/2023/wordml/word16du" xmlns:w16sdtdh="http://schemas.microsoft.com/office/word/2020/wordml/sdtdatahash" xmlns:w16sdtfl="http://schemas.microsoft.com/office/word/2024/wordml/sdtformatlock" xmlns:w16se="http://schemas.microsoft.com/office/word/2015/wordml/symex" xmlns:wpg="http://schemas.microsoft.com/office/word/2010/wordprocessingGroup" xmlns:wpi="http://schemas.microsoft.com/office/word/2010/wordprocessingInk" xmlns:wne="http://schemas.microsoft.com/office/word/2006/wordml" xmlns:wps="http://schemas.microsoft.com/office/word/2010/wordprocessingShape" mc:Ignorable="w14 w15 w16se w16cid w16 w16cex w16sdtdh w16sdtfl w16du wp14">
+  <w:endnote w:type="separator" w:id="-1">
+    <w:p>
+      <w:pPr>
+        <w:spacing w:after="0" w:line="240" w:lineRule="auto"/>
+      </w:pPr>
+      <w:r>
+        <w:separator/>
+      </w:r>
+    </w:p>
+  </w:endnote>
+  <w:endnote w:type="continuationSeparator" w:id="0">
+    <w:p>
+      <w:pPr>
+        <w:spacing w:after="0" w:line="240" w:lineRule="auto"/>
+      </w:pPr>
+      <w:r>
+        <w:continuationSeparator/>
+      </w:r>
+    </w:p>
+  </w:endnote>
+</w:endnotes>
+</file>
+
+<file path=word/footer1.xml><?xml version="1.0" encoding="utf-8"?>
+<w:ftr xmlns:wpc="http://schemas.microsoft.com/office/word/2010/wordprocessingCanvas" xmlns:cx="http://schemas.microsoft.com/office/drawing/2014/chartex" xmlns:cx1="http://schemas.microsoft.com/office/drawing/2015/9/8/chartex" xmlns:cx2="http://schemas.microsoft.com/office/drawing/2015/10/21/chartex" xmlns:cx3="http://schemas.microsoft.com/office/drawing/2016/5/9/chartex" xmlns:cx4="http://schemas.microsoft.com/office/drawing/2016/5/10/chartex" xmlns:cx5="http://schemas.microsoft.com/office/drawing/2016/5/11/chartex" xmlns:cx6="http://schemas.microsoft.com/office/drawing/2016/5/12/chartex" xmlns:cx7="http://schemas.microsoft.com/office/drawing/2016/5/13/chartex" xmlns:cx8="http://schemas.microsoft.com/office/drawing/2016/5/14/chartex" xmlns:mc="http://schemas.openxmlformats.org/markup-compatibility/2006" xmlns:aink="http://schemas.microsoft.com/office/drawing/2016/ink" xmlns:am3d="http://schemas.microsoft.com/office/drawing/2017/model3d" xmlns:o="urn:schemas-microsoft-com:office:office" xmlns:oel="http://schemas.microsoft.com/office/2019/extlst" xmlns:r="http://schemas.openxmlformats.org/officeDocument/2006/relationships" xmlns:m="http://schemas.openxmlformats.org/officeDocument/2006/math" xmlns:v="urn:schemas-microsoft-com:vml" xmlns:wp14="http://schemas.microsoft.com/office/word/2010/wordprocessingDrawing" xmlns:wp="http://schemas.openxmlformats.org/drawingml/2006/wordprocessingDrawing" xmlns:w10="urn:schemas-microsoft-com:office:word" xmlns:w="http://schemas.openxmlformats.org/wordprocessingml/2006/main" xmlns:w14="http://schemas.microsoft.com/office/word/2010/wordml" xmlns:w15="http://schemas.microsoft.com/office/word/2012/wordml" xmlns:w16cex="http://schemas.microsoft.com/office/word/2018/wordml/cex" xmlns:w16cid="http://schemas.microsoft.com/office/word/2016/wordml/cid" xmlns:w16="http://schemas.microsoft.com/office/word/2018/wordml" xmlns:w16du="http://schemas.microsoft.com/office/word/2023/wordml/word16du" xmlns:w16sdtdh="http://schemas.microsoft.com/office/word/2020/wordml/sdtdatahash" xmlns:w16sdtfl="http://schemas.microsoft.com/office/word/2024/wordml/sdtformatlock" xmlns:w16se="http://schemas.microsoft.com/office/word/2015/wordml/symex" xmlns:wpg="http://schemas.microsoft.com/office/word/2010/wordprocessingGroup" xmlns:wpi="http://schemas.microsoft.com/office/word/2010/wordprocessingInk" xmlns:wne="http://schemas.microsoft.com/office/word/2006/wordml" xmlns:wps="http://schemas.microsoft.com/office/word/2010/wordprocessingShape" mc:Ignorable="w14 w15 w16se w16cid w16 w16cex w16sdtdh w16sdtfl w16du wp14">
+  <w:sdt>
+    <w:sdtPr>
+      <w:id w:val="-201173479"/>
+      <w:docPartObj>
+        <w:docPartGallery w:val="Page Numbers (Bottom of Page)"/>
+        <w:docPartUnique/>
+      </w:docPartObj>
+    </w:sdtPr>
+    <w:sdtContent>
+      <w:sdt>
+        <w:sdtPr>
+          <w:id w:val="-1769616900"/>
+          <w:docPartObj>
+            <w:docPartGallery w:val="Page Numbers (Top of Page)"/>
+            <w:docPartUnique/>
+          </w:docPartObj>
+        </w:sdtPr>
+        <w:sdtContent>
+          <w:p>
+            <w:pPr>
+              <w:pStyle w:val="Footer"/>
+              <w:jc w:val="right"/>
+            </w:pPr>
+            <w:r>
+              <w:t xml:space="preserve">Page </w:t>
+            </w:r>
+            <w:r>
+              <w:rPr>
+                <w:b/>
+                <w:bCs/>
+              </w:rPr>
+              <w:fldChar w:fldCharType="begin"/>
+            </w:r>
+            <w:r>
+              <w:rPr>
+                <w:b/>
+                <w:bCs/>
+              </w:rPr>
+              <w:instrText xml:space="preserve"> PAGE </w:instrText>
+            </w:r>
+            <w:r>
+              <w:rPr>
+                <w:b/>
+                <w:bCs/>
+              </w:rPr>
+              <w:fldChar w:fldCharType="separate"/>
+            </w:r>
+            <w:r>
+              <w:rPr>
+                <w:b/>
+                <w:bCs/>
+                <w:noProof/>
+              </w:rPr>
+              <w:t>2</w:t>
+            </w:r>
+            <w:r>
+              <w:rPr>
+                <w:b/>
+                <w:bCs/>
+              </w:rPr>
+              <w:fldChar w:fldCharType="end"/>
+            </w:r>
+            <w:r>
+              <w:t xml:space="preserve"> of </w:t>
+            </w:r>
+            <w:r>
+              <w:rPr>
+                <w:b/>
+                <w:bCs/>
+              </w:rPr>
+              <w:fldChar w:fldCharType="begin"/>
+            </w:r>
+            <w:r>
+              <w:rPr>
+                <w:b/>
+                <w:bCs/>
+              </w:rPr>
+              <w:instrText xml:space="preserve"> NUMPAGES  </w:instrText>
+            </w:r>
+            <w:r>
+              <w:rPr>
+                <w:b/>
+                <w:bCs/>
+              </w:rPr>
+              <w:fldChar w:fldCharType="separate"/>
+            </w:r>
+            <w:r>
+              <w:rPr>
+                <w:b/>
+                <w:bCs/>
+                <w:noProof/>
+              </w:rPr>
+              <w:t>2</w:t>
+            </w:r>
+            <w:r>
+              <w:rPr>
+                <w:b/>
+                <w:bCs/>
+              </w:rPr>
+              <w:fldChar w:fldCharType="end"/>
+            </w:r>
+          </w:p>
+        </w:sdtContent>
+      </w:sdt>
+    </w:sdtContent>
+  </w:sdt>
+  <w:p>
+    <w:pPr>
+      <w:pStyle w:val="Footer"/>
+    </w:pPr>
+  </w:p>
+</w:ftr>
+</file>
+
+<file path=word/footnotes.xml><?xml version="1.0" encoding="utf-8"?>
+<w:footnotes xmlns:wpc="http://schemas.microsoft.com/office/word/2010/wordprocessingCanvas" xmlns:cx="http://schemas.microsoft.com/office/drawing/2014/chartex" xmlns:cx1="http://schemas.microsoft.com/office/drawing/2015/9/8/chartex" xmlns:cx2="http://schemas.microsoft.com/office/drawing/2015/10/21/chartex" xmlns:cx3="http://schemas.microsoft.com/office/drawing/2016/5/9/chartex" xmlns:cx4="http://schemas.microsoft.com/office/drawing/2016/5/10/chartex" xmlns:cx5="http://schemas.microsoft.com/office/drawing/2016/5/11/chartex" xmlns:cx6="http://schemas.microsoft.com/office/drawing/2016/5/12/chartex" xmlns:cx7="http://schemas.microsoft.com/office/drawing/2016/5/13/chartex" xmlns:cx8="http://schemas.microsoft.com/office/drawing/2016/5/14/chartex" xmlns:mc="http://schemas.openxmlformats.org/markup-compatibility/2006" xmlns:aink="http://schemas.microsoft.com/office/drawing/2016/ink" xmlns:am3d="http://schemas.microsoft.com/office/drawing/2017/model3d" xmlns:o="urn:schemas-microsoft-com:office:office" xmlns:oel="http://schemas.microsoft.com/office/2019/extlst" xmlns:r="http://schemas.openxmlformats.org/officeDocument/2006/relationships" xmlns:m="http://schemas.openxmlformats.org/officeDocument/2006/math" xmlns:v="urn:schemas-microsoft-com:vml" xmlns:wp14="http://schemas.microsoft.com/office/word/2010/wordprocessingDrawing" xmlns:wp="http://schemas.openxmlformats.org/drawingml/2006/wordprocessingDrawing" xmlns:w10="urn:schemas-microsoft-com:office:word" xmlns:w="http://schemas.openxmlformats.org/wordprocessingml/2006/main" xmlns:w14="http://schemas.microsoft.com/office/word/2010/wordml" xmlns:w15="http://schemas.microsoft.com/office/word/2012/wordml" xmlns:w16cex="http://schemas.microsoft.com/office/word/2018/wordml/cex" xmlns:w16cid="http://schemas.microsoft.com/office/word/2016/wordml/cid" xmlns:w16="http://schemas.microsoft.com/office/word/2018/wordml" xmlns:w16du="http://schemas.microsoft.com/office/word/2023/wordml/word16du" xmlns:w16sdtdh="http://schemas.microsoft.com/office/word/2020/wordml/sdtdatahash" xmlns:w16sdtfl="http://schemas.microsoft.com/office/word/2024/wordml/sdtformatlock" xmlns:w16se="http://schemas.microsoft.com/office/word/2015/wordml/symex" xmlns:wpg="http://schemas.microsoft.com/office/word/2010/wordprocessingGroup" xmlns:wpi="http://schemas.microsoft.com/office/word/2010/wordprocessingInk" xmlns:wne="http://schemas.microsoft.com/office/word/2006/wordml" xmlns:wps="http://schemas.microsoft.com/office/word/2010/wordprocessingShape" mc:Ignorable="w14 w15 w16se w16cid w16 w16cex w16sdtdh w16sdtfl w16du wp14">
+  <w:footnote w:type="separator" w:id="-1">
+    <w:p>
+      <w:pPr>
+        <w:spacing w:after="0" w:line="240" w:lineRule="auto"/>
+      </w:pPr>
+      <w:r>
+        <w:separator/>
+      </w:r>
+    </w:p>
+  </w:footnote>
+  <w:footnote w:type="continuationSeparator" w:id="0">
+    <w:p>
+      <w:pPr>
+        <w:spacing w:after="0" w:line="240" w:lineRule="auto"/>
+      </w:pPr>
+      <w:r>
+        <w:continuationSeparator/>
+      </w:r>
+    </w:p>
+  </w:footnote>
+</w:footnotes>
+</file>
+
+<file path=word/header1.xml><?xml version="1.0" encoding="utf-8"?>
+<w:hdr xmlns:wpc="http://schemas.microsoft.com/office/word/2010/wordprocessingCanvas" xmlns:cx="http://schemas.microsoft.com/office/drawing/2014/chartex" xmlns:cx1="http://schemas.microsoft.com/office/drawing/2015/9/8/chartex" xmlns:cx2="http://schemas.microsoft.com/office/drawing/2015/10/21/chartex" xmlns:cx3="http://schemas.microsoft.com/office/drawing/2016/5/9/chartex" xmlns:cx4="http://schemas.microsoft.com/office/drawing/2016/5/10/chartex" xmlns:cx5="http://schemas.microsoft.com/office/drawing/2016/5/11/chartex" xmlns:cx6="http://schemas.microsoft.com/office/drawing/2016/5/12/chartex" xmlns:cx7="http://schemas.microsoft.com/office/drawing/2016/5/13/chartex" xmlns:cx8="http://schemas.microsoft.com/office/drawing/2016/5/14/chartex" xmlns:mc="http://schemas.openxmlformats.org/markup-compatibility/2006" xmlns:aink="http://schemas.microsoft.com/office/drawing/2016/ink" xmlns:am3d="http://schemas.microsoft.com/office/drawing/2017/model3d" xmlns:o="urn:schemas-microsoft-com:office:office" xmlns:oel="http://schemas.microsoft.com/office/2019/extlst" xmlns:r="http://schemas.openxmlformats.org/officeDocument/2006/relationships" xmlns:m="http://schemas.openxmlformats.org/officeDocument/2006/math" xmlns:v="urn:schemas-microsoft-com:vml" xmlns:wp14="http://schemas.microsoft.com/office/word/2010/wordprocessingDrawing" xmlns:wp="http://schemas.openxmlformats.org/drawingml/2006/wordprocessingDrawing" xmlns:w10="urn:schemas-microsoft-com:office:word" xmlns:w="http://schemas.openxmlformats.org/wordprocessingml/2006/main" xmlns:w14="http://schemas.microsoft.com/office/word/2010/wordml" xmlns:w15="http://schemas.microsoft.com/office/word/2012/wordml" xmlns:w16cex="http://schemas.microsoft.com/office/word/2018/wordml/cex" xmlns:w16cid="http://schemas.microsoft.com/office/word/2016/wordml/cid" xmlns:w16="http://schemas.microsoft.com/office/word/2018/wordml" xmlns:w16du="http://schemas.microsoft.com/office/word/2023/wordml/word16du" xmlns:w16sdtdh="http://schemas.microsoft.com/office/word/2020/wordml/sdtdatahash" xmlns:w16sdtfl="http://schemas.microsoft.com/office/word/2024/wordml/sdtformatlock" xmlns:w16se="http://schemas.microsoft.com/office/word/2015/wordml/symex" xmlns:wpg="http://schemas.microsoft.com/office/word/2010/wordprocessingGroup" xmlns:wpi="http://schemas.microsoft.com/office/word/2010/wordprocessingInk" xmlns:wne="http://schemas.microsoft.com/office/word/2006/wordml" xmlns:wps="http://schemas.microsoft.com/office/word/2010/wordprocessingShape" mc:Ignorable="w14 w15 w16se w16cid w16 w16cex w16sdtdh w16sdtfl w16du wp14">
+  <w:p>
+    <w:pPr>
+      <w:pStyle w:val="Header"/>
+    </w:pPr>
+    <w:r>
+      <w:t>BCIT</w:t>
+    </w:r>
+    <w:r>
+      <w:t xml:space="preserve">601. </w:t>
+    </w:r>
+    <w:r>
+      <w:t>Assignment 2. Iteration 2</w:t>
+    </w:r>
+    <w:r>
+      <w:tab/>
+    </w:r>
+    <w:r>
+      <w:tab/>
+      <w:t>Samuel Willyams</w:t>
+    </w:r>
+  </w:p>
+</w:hdr>
 </file>
 
 <file path=word/numbering.xml><?xml version="1.0" encoding="utf-8"?>
@@ -851,7 +1710,6 @@
   <w:style w:type="character" w:default="1" w:styleId="DefaultParagraphFont">
     <w:name w:val="Default Paragraph Font"/>
     <w:uiPriority w:val="1"/>
-    <w:semiHidden/>
     <w:unhideWhenUsed/>
   </w:style>
   <w:style w:type="table" w:default="1" w:styleId="TableNormal">
@@ -1199,6 +2057,50 @@
       <w:color w:val="96607D" w:themeColor="followedHyperlink"/>
       <w:u w:val="single"/>
     </w:rPr>
+  </w:style>
+  <w:style w:type="paragraph" w:styleId="Header">
+    <w:name w:val="header"/>
+    <w:basedOn w:val="Normal"/>
+    <w:link w:val="HeaderChar"/>
+    <w:uiPriority w:val="99"/>
+    <w:unhideWhenUsed/>
+    <w:rsid w:val="00C519C8"/>
+    <w:pPr>
+      <w:tabs>
+        <w:tab w:val="center" w:pos="4513"/>
+        <w:tab w:val="right" w:pos="9026"/>
+      </w:tabs>
+      <w:spacing w:after="0" w:line="240" w:lineRule="auto"/>
+    </w:pPr>
+  </w:style>
+  <w:style w:type="character" w:customStyle="1" w:styleId="HeaderChar">
+    <w:name w:val="Header Char"/>
+    <w:basedOn w:val="DefaultParagraphFont"/>
+    <w:link w:val="Header"/>
+    <w:uiPriority w:val="99"/>
+    <w:rsid w:val="00C519C8"/>
+  </w:style>
+  <w:style w:type="paragraph" w:styleId="Footer">
+    <w:name w:val="footer"/>
+    <w:basedOn w:val="Normal"/>
+    <w:link w:val="FooterChar"/>
+    <w:uiPriority w:val="99"/>
+    <w:unhideWhenUsed/>
+    <w:rsid w:val="00C519C8"/>
+    <w:pPr>
+      <w:tabs>
+        <w:tab w:val="center" w:pos="4513"/>
+        <w:tab w:val="right" w:pos="9026"/>
+      </w:tabs>
+      <w:spacing w:after="0" w:line="240" w:lineRule="auto"/>
+    </w:pPr>
+  </w:style>
+  <w:style w:type="character" w:customStyle="1" w:styleId="FooterChar">
+    <w:name w:val="Footer Char"/>
+    <w:basedOn w:val="DefaultParagraphFont"/>
+    <w:link w:val="Footer"/>
+    <w:uiPriority w:val="99"/>
+    <w:rsid w:val="00C519C8"/>
   </w:style>
 </w:styles>
 </file>

</xml_diff>